<commit_message>
feat: hoan thanh bai tap tuan 2
</commit_message>
<xml_diff>
--- a/Tuan02/MaiThanhHaiQuan_22653671_Tuan02.docx
+++ b/Tuan02/MaiThanhHaiQuan_22653671_Tuan02.docx
@@ -119,16 +119,19 @@
     </w:p>
     <w:p>
       <w:pPr>
+        <w:spacing w:after="0" w:line="360" w:lineRule="auto"/>
         <w:ind w:left="720"/>
+        <w:rPr>
+          <w:rFonts w:cs="Times New Roman"/>
+          <w:szCs w:val="26"/>
+        </w:rPr>
       </w:pPr>
       <w:r>
         <w:rPr>
-          <w:szCs w:val="26"/>
-        </w:rPr>
-        <w:t xml:space="preserve">- </w:t>
-      </w:r>
-      <w:r>
-        <w:t>Scalability (khả năng mở rộng) là khả năng của hệ thống xử lý được sự gia tăng về số lượng người dùng, request hoặc dữ liệu mà không làm giảm hiệu năng đáng kể.</w:t>
+          <w:rFonts w:cs="Times New Roman"/>
+          <w:szCs w:val="26"/>
+        </w:rPr>
+        <w:t>- Scalability (khả năng mở rộng) là khả năng của hệ thống xử lý được sự gia tăng về số lượng người dùng, request hoặc dữ liệu mà không làm giảm hiệu năng đáng kể.</w:t>
       </w:r>
     </w:p>
     <w:p>
@@ -149,49 +152,75 @@
           <w:sz w:val="26"/>
           <w:szCs w:val="26"/>
         </w:rPr>
-        <w:t>Các loạ</w:t>
-      </w:r>
-      <w:r>
-        <w:rPr>
-          <w:sz w:val="26"/>
-          <w:szCs w:val="26"/>
-        </w:rPr>
-        <w:t>i</w:t>
+        <w:t>Các loại</w:t>
       </w:r>
     </w:p>
     <w:p>
       <w:pPr>
+        <w:spacing w:after="0" w:line="360" w:lineRule="auto"/>
         <w:ind w:left="720"/>
+        <w:rPr>
+          <w:rFonts w:cs="Times New Roman"/>
+          <w:szCs w:val="26"/>
+        </w:rPr>
       </w:pPr>
       <w:r>
+        <w:rPr>
+          <w:rFonts w:cs="Times New Roman"/>
+          <w:szCs w:val="26"/>
+        </w:rPr>
         <w:t>- Vertical Scaling: Tăng tài nguyên phần cứng cho một server.</w:t>
       </w:r>
     </w:p>
     <w:p>
       <w:pPr>
+        <w:spacing w:after="0" w:line="360" w:lineRule="auto"/>
         <w:ind w:left="720"/>
+        <w:rPr>
+          <w:rFonts w:cs="Times New Roman"/>
+          <w:szCs w:val="26"/>
+        </w:rPr>
       </w:pPr>
       <w:r>
+        <w:rPr>
+          <w:rFonts w:cs="Times New Roman"/>
+          <w:szCs w:val="26"/>
+        </w:rPr>
         <w:t>- Horizontal Scaling: Tăng số lượng server và phân phối tải.</w:t>
       </w:r>
     </w:p>
     <w:p>
       <w:pPr>
+        <w:spacing w:after="0" w:line="360" w:lineRule="auto"/>
         <w:ind w:left="720"/>
+        <w:rPr>
+          <w:rFonts w:cs="Times New Roman"/>
+          <w:szCs w:val="26"/>
+        </w:rPr>
       </w:pPr>
       <w:r>
+        <w:rPr>
+          <w:rFonts w:cs="Times New Roman"/>
+          <w:szCs w:val="26"/>
+        </w:rPr>
         <w:t>- Database Scaling: Read Replica, Sharding.</w:t>
       </w:r>
     </w:p>
     <w:p>
       <w:pPr>
+        <w:spacing w:after="0" w:line="360" w:lineRule="auto"/>
         <w:ind w:left="720"/>
+        <w:rPr>
+          <w:rFonts w:cs="Times New Roman"/>
+          <w:szCs w:val="26"/>
+        </w:rPr>
       </w:pPr>
       <w:r>
-        <w:t>- Microservices Scaling: Scale từng service độc lập</w:t>
-      </w:r>
-      <w:r>
-        <w:t>.</w:t>
+        <w:rPr>
+          <w:rFonts w:cs="Times New Roman"/>
+          <w:szCs w:val="26"/>
+        </w:rPr>
+        <w:t>- Microservices Scaling: Scale từng service độc lập.</w:t>
       </w:r>
     </w:p>
     <w:p>
@@ -217,9 +246,18 @@
     </w:p>
     <w:p>
       <w:pPr>
+        <w:spacing w:after="0" w:line="360" w:lineRule="auto"/>
         <w:ind w:left="360" w:firstLine="360"/>
+        <w:rPr>
+          <w:rFonts w:cs="Times New Roman"/>
+          <w:szCs w:val="26"/>
+        </w:rPr>
       </w:pPr>
       <w:r>
+        <w:rPr>
+          <w:rFonts w:cs="Times New Roman"/>
+          <w:szCs w:val="26"/>
+        </w:rPr>
         <w:t>Docker, Kubernetes, Nginx, Redis, Kong API Gateway, MySQL Replication.</w:t>
       </w:r>
     </w:p>
@@ -274,13 +312,19 @@
     </w:p>
     <w:p>
       <w:pPr>
+        <w:spacing w:after="0" w:line="360" w:lineRule="auto"/>
         <w:ind w:left="720"/>
+        <w:rPr>
+          <w:rFonts w:cs="Times New Roman"/>
+          <w:szCs w:val="26"/>
+        </w:rPr>
       </w:pPr>
       <w:r>
-        <w:t xml:space="preserve">- </w:t>
-      </w:r>
-      <w:r>
-        <w:t>Performance là khả năng xử lý request nhanh chóng và hiệu quả của hệ thống.</w:t>
+        <w:rPr>
+          <w:rFonts w:cs="Times New Roman"/>
+          <w:szCs w:val="26"/>
+        </w:rPr>
+        <w:t>- Performance là khả năng xử lý request nhanh chóng và hiệu quả của hệ thống.</w:t>
       </w:r>
     </w:p>
     <w:p>
@@ -306,33 +350,69 @@
     </w:p>
     <w:p>
       <w:pPr>
+        <w:spacing w:after="0" w:line="360" w:lineRule="auto"/>
         <w:ind w:left="720"/>
+        <w:rPr>
+          <w:rFonts w:cs="Times New Roman"/>
+          <w:szCs w:val="26"/>
+        </w:rPr>
       </w:pPr>
       <w:r>
+        <w:rPr>
+          <w:rFonts w:cs="Times New Roman"/>
+          <w:szCs w:val="26"/>
+        </w:rPr>
         <w:t>- Cache dữ liệu (Redis)</w:t>
       </w:r>
     </w:p>
     <w:p>
       <w:pPr>
+        <w:spacing w:after="0" w:line="360" w:lineRule="auto"/>
         <w:ind w:left="720"/>
+        <w:rPr>
+          <w:rFonts w:cs="Times New Roman"/>
+          <w:szCs w:val="26"/>
+        </w:rPr>
       </w:pPr>
       <w:r>
+        <w:rPr>
+          <w:rFonts w:cs="Times New Roman"/>
+          <w:szCs w:val="26"/>
+        </w:rPr>
         <w:t>- Message Queue (RabbitMQ, Kafka)</w:t>
       </w:r>
     </w:p>
     <w:p>
       <w:pPr>
+        <w:spacing w:after="0" w:line="360" w:lineRule="auto"/>
         <w:ind w:left="720"/>
+        <w:rPr>
+          <w:rFonts w:cs="Times New Roman"/>
+          <w:szCs w:val="26"/>
+        </w:rPr>
       </w:pPr>
       <w:r>
+        <w:rPr>
+          <w:rFonts w:cs="Times New Roman"/>
+          <w:szCs w:val="26"/>
+        </w:rPr>
         <w:t>- Async Processing</w:t>
       </w:r>
     </w:p>
     <w:p>
       <w:pPr>
+        <w:spacing w:after="0" w:line="360" w:lineRule="auto"/>
         <w:ind w:left="720"/>
+        <w:rPr>
+          <w:rFonts w:cs="Times New Roman"/>
+          <w:szCs w:val="26"/>
+        </w:rPr>
       </w:pPr>
       <w:r>
+        <w:rPr>
+          <w:rFonts w:cs="Times New Roman"/>
+          <w:szCs w:val="26"/>
+        </w:rPr>
         <w:t>- Tối ưu database (Index, Pagination)</w:t>
       </w:r>
     </w:p>
@@ -359,9 +439,18 @@
     </w:p>
     <w:p>
       <w:pPr>
+        <w:spacing w:after="0" w:line="360" w:lineRule="auto"/>
         <w:ind w:left="720"/>
+        <w:rPr>
+          <w:rFonts w:cs="Times New Roman"/>
+          <w:szCs w:val="26"/>
+        </w:rPr>
       </w:pPr>
       <w:r>
+        <w:rPr>
+          <w:rFonts w:cs="Times New Roman"/>
+          <w:szCs w:val="26"/>
+        </w:rPr>
         <w:t>Redis, RabbitMQ, Kafka, Spring Async, HikariCP.</w:t>
       </w:r>
     </w:p>
@@ -388,23 +477,43 @@
     </w:p>
     <w:p>
       <w:pPr>
+        <w:spacing w:after="0" w:line="360" w:lineRule="auto"/>
         <w:ind w:left="720"/>
+        <w:rPr>
+          <w:rFonts w:cs="Times New Roman"/>
+          <w:szCs w:val="26"/>
+        </w:rPr>
       </w:pPr>
       <w:r>
+        <w:rPr>
+          <w:rFonts w:cs="Times New Roman"/>
+          <w:szCs w:val="26"/>
+        </w:rPr>
         <w:t>- Không cache:</w:t>
       </w:r>
       <w:r>
-        <w:t xml:space="preserve"> </w:t>
-      </w:r>
-      <w:r>
-        <w:t>468ms</w:t>
+        <w:rPr>
+          <w:rFonts w:cs="Times New Roman"/>
+          <w:szCs w:val="26"/>
+        </w:rPr>
+        <w:t xml:space="preserve"> 468ms</w:t>
       </w:r>
     </w:p>
     <w:p>
       <w:pPr>
+        <w:spacing w:after="0" w:line="360" w:lineRule="auto"/>
         <w:ind w:left="720"/>
+        <w:rPr>
+          <w:rFonts w:cs="Times New Roman"/>
+          <w:szCs w:val="26"/>
+        </w:rPr>
       </w:pPr>
       <w:r>
+        <w:rPr>
+          <w:rFonts w:cs="Times New Roman"/>
+          <w:noProof/>
+          <w:szCs w:val="26"/>
+        </w:rPr>
         <w:lastRenderedPageBreak/>
         <w:drawing>
           <wp:inline distT="0" distB="0" distL="0" distR="0" wp14:anchorId="52C95BC9" wp14:editId="78A8ADE9">
@@ -445,20 +554,43 @@
     </w:p>
     <w:p>
       <w:pPr>
+        <w:spacing w:after="0" w:line="360" w:lineRule="auto"/>
         <w:ind w:left="720"/>
+        <w:rPr>
+          <w:rFonts w:cs="Times New Roman"/>
+          <w:szCs w:val="26"/>
+        </w:rPr>
       </w:pPr>
       <w:r>
+        <w:rPr>
+          <w:rFonts w:cs="Times New Roman"/>
+          <w:szCs w:val="26"/>
+        </w:rPr>
         <w:t xml:space="preserve">- Có Redis cache: </w:t>
       </w:r>
       <w:r>
+        <w:rPr>
+          <w:rFonts w:cs="Times New Roman"/>
+          <w:szCs w:val="26"/>
+        </w:rPr>
         <w:t>159ms</w:t>
       </w:r>
     </w:p>
     <w:p>
       <w:pPr>
+        <w:spacing w:after="0" w:line="360" w:lineRule="auto"/>
         <w:ind w:left="720"/>
+        <w:rPr>
+          <w:rFonts w:cs="Times New Roman"/>
+          <w:szCs w:val="26"/>
+        </w:rPr>
       </w:pPr>
       <w:r>
+        <w:rPr>
+          <w:rFonts w:cs="Times New Roman"/>
+          <w:noProof/>
+          <w:szCs w:val="26"/>
+        </w:rPr>
         <w:lastRenderedPageBreak/>
         <w:drawing>
           <wp:inline distT="0" distB="0" distL="0" distR="0" wp14:anchorId="6231EF9F" wp14:editId="16A4F738">
@@ -541,13 +673,19 @@
     </w:p>
     <w:p>
       <w:pPr>
+        <w:spacing w:after="0" w:line="360" w:lineRule="auto"/>
         <w:ind w:left="720"/>
+        <w:rPr>
+          <w:rFonts w:cs="Times New Roman"/>
+          <w:szCs w:val="26"/>
+        </w:rPr>
       </w:pPr>
       <w:r>
-        <w:t xml:space="preserve">- </w:t>
-      </w:r>
-      <w:r>
-        <w:t>Security là việc bảo vệ hệ thống khỏi truy cập trái phép và các cuộc tấn công.</w:t>
+        <w:rPr>
+          <w:rFonts w:cs="Times New Roman"/>
+          <w:szCs w:val="26"/>
+        </w:rPr>
+        <w:t>- Security là việc bảo vệ hệ thống khỏi truy cập trái phép và các cuộc tấn công.</w:t>
       </w:r>
     </w:p>
     <w:p>
@@ -573,25 +711,52 @@
     </w:p>
     <w:p>
       <w:pPr>
+        <w:spacing w:after="0" w:line="360" w:lineRule="auto"/>
         <w:ind w:left="720"/>
+        <w:rPr>
+          <w:rFonts w:cs="Times New Roman"/>
+          <w:szCs w:val="26"/>
+        </w:rPr>
       </w:pPr>
       <w:r>
+        <w:rPr>
+          <w:rFonts w:cs="Times New Roman"/>
+          <w:szCs w:val="26"/>
+        </w:rPr>
         <w:t>- Truy cập trái phép</w:t>
       </w:r>
     </w:p>
     <w:p>
       <w:pPr>
+        <w:spacing w:after="0" w:line="360" w:lineRule="auto"/>
         <w:ind w:left="720"/>
+        <w:rPr>
+          <w:rFonts w:cs="Times New Roman"/>
+          <w:szCs w:val="26"/>
+        </w:rPr>
       </w:pPr>
       <w:r>
+        <w:rPr>
+          <w:rFonts w:cs="Times New Roman"/>
+          <w:szCs w:val="26"/>
+        </w:rPr>
         <w:t>- SQL Injection</w:t>
       </w:r>
     </w:p>
     <w:p>
       <w:pPr>
+        <w:spacing w:after="0" w:line="360" w:lineRule="auto"/>
         <w:ind w:left="720"/>
+        <w:rPr>
+          <w:rFonts w:cs="Times New Roman"/>
+          <w:szCs w:val="26"/>
+        </w:rPr>
       </w:pPr>
       <w:r>
+        <w:rPr>
+          <w:rFonts w:cs="Times New Roman"/>
+          <w:szCs w:val="26"/>
+        </w:rPr>
         <w:t>- Token bị đánh cắp</w:t>
       </w:r>
     </w:p>
@@ -618,47 +783,24 @@
     </w:p>
     <w:p>
       <w:pPr>
+        <w:spacing w:after="0" w:line="360" w:lineRule="auto"/>
         <w:ind w:left="720"/>
+        <w:rPr>
+          <w:rFonts w:cs="Times New Roman"/>
+          <w:szCs w:val="26"/>
+        </w:rPr>
       </w:pPr>
       <w:r>
+        <w:rPr>
+          <w:rFonts w:cs="Times New Roman"/>
+          <w:szCs w:val="26"/>
+        </w:rPr>
         <w:t>Spring Security, JWT, OAuth2, Kong API Gateway.</w:t>
       </w:r>
     </w:p>
     <w:p>
       <w:pPr>
         <w:pStyle w:val="NormalWeb"/>
-        <w:numPr>
-          <w:ilvl w:val="0"/>
-          <w:numId w:val="34"/>
-        </w:numPr>
-        <w:spacing w:before="0" w:beforeAutospacing="0" w:after="0" w:afterAutospacing="0" w:line="360" w:lineRule="auto"/>
-        <w:rPr>
-          <w:sz w:val="26"/>
-          <w:szCs w:val="26"/>
-        </w:rPr>
-      </w:pPr>
-      <w:r>
-        <w:rPr>
-          <w:sz w:val="26"/>
-          <w:szCs w:val="26"/>
-        </w:rPr>
-        <w:t>Bài toán nhỏ</w:t>
-      </w:r>
-    </w:p>
-    <w:p>
-      <w:pPr>
-        <w:ind w:left="720"/>
-      </w:pPr>
-      <w:r>
-        <w:t xml:space="preserve">- </w:t>
-      </w:r>
-      <w:r>
-        <w:t>Chỉ người dùng có role ADMIN mới được phép xoá user thông qua kiểm tra JWT và phân quyền.</w:t>
-      </w:r>
-    </w:p>
-    <w:p>
-      <w:pPr>
-        <w:pStyle w:val="NormalWeb"/>
         <w:spacing w:before="0" w:beforeAutospacing="0" w:after="0" w:afterAutospacing="0" w:line="360" w:lineRule="auto"/>
         <w:rPr>
           <w:sz w:val="26"/>
@@ -675,6 +817,410 @@
     </w:p>
     <w:p>
       <w:pPr>
+        <w:spacing w:after="0" w:line="360" w:lineRule="auto"/>
+        <w:rPr>
+          <w:rFonts w:eastAsia="Times New Roman" w:cs="Times New Roman"/>
+          <w:szCs w:val="26"/>
+        </w:rPr>
+      </w:pPr>
+      <w:r>
+        <w:rPr>
+          <w:rFonts w:eastAsia="Times New Roman" w:cs="Times New Roman"/>
+          <w:b/>
+          <w:bCs/>
+          <w:szCs w:val="26"/>
+        </w:rPr>
+        <w:t>Hệ thống quản lý đơn hàng</w:t>
+      </w:r>
+      <w:r>
+        <w:rPr>
+          <w:rFonts w:eastAsia="Times New Roman" w:cs="Times New Roman"/>
+          <w:szCs w:val="26"/>
+        </w:rPr>
+        <w:t xml:space="preserve"> với các trạng thái:</w:t>
+      </w:r>
+    </w:p>
+    <w:p>
+      <w:pPr>
+        <w:numPr>
+          <w:ilvl w:val="0"/>
+          <w:numId w:val="35"/>
+        </w:numPr>
+        <w:spacing w:after="0" w:line="360" w:lineRule="auto"/>
+        <w:rPr>
+          <w:rFonts w:eastAsia="Times New Roman" w:cs="Times New Roman"/>
+          <w:szCs w:val="26"/>
+        </w:rPr>
+      </w:pPr>
+      <w:r>
+        <w:rPr>
+          <w:rFonts w:eastAsia="Times New Roman" w:cs="Times New Roman"/>
+          <w:szCs w:val="26"/>
+        </w:rPr>
+        <w:t>Mới tạo</w:t>
+      </w:r>
+    </w:p>
+    <w:p>
+      <w:pPr>
+        <w:numPr>
+          <w:ilvl w:val="0"/>
+          <w:numId w:val="35"/>
+        </w:numPr>
+        <w:spacing w:after="0" w:line="360" w:lineRule="auto"/>
+        <w:rPr>
+          <w:rFonts w:eastAsia="Times New Roman" w:cs="Times New Roman"/>
+          <w:szCs w:val="26"/>
+        </w:rPr>
+      </w:pPr>
+      <w:r>
+        <w:rPr>
+          <w:rFonts w:eastAsia="Times New Roman" w:cs="Times New Roman"/>
+          <w:szCs w:val="26"/>
+        </w:rPr>
+        <w:t>Đang xử lý</w:t>
+      </w:r>
+    </w:p>
+    <w:p>
+      <w:pPr>
+        <w:numPr>
+          <w:ilvl w:val="0"/>
+          <w:numId w:val="35"/>
+        </w:numPr>
+        <w:spacing w:after="0" w:line="360" w:lineRule="auto"/>
+        <w:rPr>
+          <w:rFonts w:eastAsia="Times New Roman" w:cs="Times New Roman"/>
+          <w:szCs w:val="26"/>
+        </w:rPr>
+      </w:pPr>
+      <w:r>
+        <w:rPr>
+          <w:rFonts w:eastAsia="Times New Roman" w:cs="Times New Roman"/>
+          <w:szCs w:val="26"/>
+        </w:rPr>
+        <w:t>Đã giao</w:t>
+      </w:r>
+    </w:p>
+    <w:p>
+      <w:pPr>
+        <w:numPr>
+          <w:ilvl w:val="0"/>
+          <w:numId w:val="35"/>
+        </w:numPr>
+        <w:spacing w:after="0" w:line="360" w:lineRule="auto"/>
+        <w:rPr>
+          <w:rFonts w:eastAsia="Times New Roman" w:cs="Times New Roman"/>
+          <w:szCs w:val="26"/>
+        </w:rPr>
+      </w:pPr>
+      <w:r>
+        <w:rPr>
+          <w:rFonts w:eastAsia="Times New Roman" w:cs="Times New Roman"/>
+          <w:szCs w:val="26"/>
+        </w:rPr>
+        <w:lastRenderedPageBreak/>
+        <w:t>Hủy</w:t>
+      </w:r>
+    </w:p>
+    <w:p>
+      <w:pPr>
+        <w:spacing w:after="0" w:line="360" w:lineRule="auto"/>
+        <w:rPr>
+          <w:rFonts w:eastAsia="Times New Roman" w:cs="Times New Roman"/>
+          <w:szCs w:val="26"/>
+        </w:rPr>
+      </w:pPr>
+      <w:r>
+        <w:rPr>
+          <w:rFonts w:eastAsia="Times New Roman" w:cs="Times New Roman"/>
+          <w:szCs w:val="26"/>
+        </w:rPr>
+        <w:t xml:space="preserve">Mỗi trạng thái có </w:t>
+      </w:r>
+      <w:r>
+        <w:rPr>
+          <w:rFonts w:eastAsia="Times New Roman" w:cs="Times New Roman"/>
+          <w:b/>
+          <w:bCs/>
+          <w:szCs w:val="26"/>
+        </w:rPr>
+        <w:t>hành vi khác nhau</w:t>
+      </w:r>
+    </w:p>
+    <w:p>
+      <w:pPr>
+        <w:spacing w:after="0" w:line="360" w:lineRule="auto"/>
+        <w:outlineLvl w:val="0"/>
+        <w:rPr>
+          <w:rFonts w:eastAsia="Times New Roman" w:cs="Times New Roman"/>
+          <w:b/>
+          <w:bCs/>
+          <w:kern w:val="36"/>
+          <w:szCs w:val="26"/>
+        </w:rPr>
+      </w:pPr>
+      <w:r>
+        <w:rPr>
+          <w:rFonts w:eastAsia="Times New Roman" w:cs="Times New Roman"/>
+          <w:b/>
+          <w:bCs/>
+          <w:kern w:val="36"/>
+          <w:szCs w:val="26"/>
+        </w:rPr>
+        <w:t>TỔNG QUAN ÁP DỤNG DESIGN PATTERN</w:t>
+      </w:r>
+    </w:p>
+    <w:tbl>
+      <w:tblPr>
+        <w:tblW w:w="8509" w:type="dxa"/>
+        <w:tblCellSpacing w:w="15" w:type="dxa"/>
+        <w:tblBorders>
+          <w:top w:val="single" w:sz="4" w:space="0" w:color="auto"/>
+          <w:left w:val="single" w:sz="4" w:space="0" w:color="auto"/>
+          <w:bottom w:val="single" w:sz="4" w:space="0" w:color="auto"/>
+          <w:right w:val="single" w:sz="4" w:space="0" w:color="auto"/>
+          <w:insideH w:val="single" w:sz="4" w:space="0" w:color="auto"/>
+          <w:insideV w:val="single" w:sz="4" w:space="0" w:color="auto"/>
+        </w:tblBorders>
+        <w:tblCellMar>
+          <w:top w:w="15" w:type="dxa"/>
+          <w:left w:w="15" w:type="dxa"/>
+          <w:bottom w:w="15" w:type="dxa"/>
+          <w:right w:w="15" w:type="dxa"/>
+        </w:tblCellMar>
+        <w:tblLook w:val="04A0" w:firstRow="1" w:lastRow="0" w:firstColumn="1" w:lastColumn="0" w:noHBand="0" w:noVBand="1"/>
+      </w:tblPr>
+      <w:tblGrid>
+        <w:gridCol w:w="1896"/>
+        <w:gridCol w:w="6613"/>
+      </w:tblGrid>
+      <w:tr>
+        <w:trPr>
+          <w:trHeight w:val="375"/>
+          <w:tblHeader/>
+          <w:tblCellSpacing w:w="15" w:type="dxa"/>
+        </w:trPr>
+        <w:tc>
+          <w:tcPr>
+            <w:tcW w:w="0" w:type="auto"/>
+            <w:vAlign w:val="center"/>
+            <w:hideMark/>
+          </w:tcPr>
+          <w:p>
+            <w:pPr>
+              <w:spacing w:after="0" w:line="360" w:lineRule="auto"/>
+              <w:jc w:val="center"/>
+              <w:rPr>
+                <w:rFonts w:eastAsia="Times New Roman" w:cs="Times New Roman"/>
+                <w:b/>
+                <w:bCs/>
+                <w:szCs w:val="26"/>
+              </w:rPr>
+            </w:pPr>
+            <w:r>
+              <w:rPr>
+                <w:rFonts w:eastAsia="Times New Roman" w:cs="Times New Roman"/>
+                <w:b/>
+                <w:bCs/>
+                <w:szCs w:val="26"/>
+              </w:rPr>
+              <w:t>Pattern</w:t>
+            </w:r>
+          </w:p>
+        </w:tc>
+        <w:tc>
+          <w:tcPr>
+            <w:tcW w:w="0" w:type="auto"/>
+            <w:vAlign w:val="center"/>
+            <w:hideMark/>
+          </w:tcPr>
+          <w:p>
+            <w:pPr>
+              <w:spacing w:after="0" w:line="360" w:lineRule="auto"/>
+              <w:jc w:val="center"/>
+              <w:rPr>
+                <w:rFonts w:eastAsia="Times New Roman" w:cs="Times New Roman"/>
+                <w:b/>
+                <w:bCs/>
+                <w:szCs w:val="26"/>
+              </w:rPr>
+            </w:pPr>
+            <w:r>
+              <w:rPr>
+                <w:rFonts w:eastAsia="Times New Roman" w:cs="Times New Roman"/>
+                <w:b/>
+                <w:bCs/>
+                <w:szCs w:val="26"/>
+              </w:rPr>
+              <w:t>Áp dụng vào</w:t>
+            </w:r>
+          </w:p>
+        </w:tc>
+      </w:tr>
+      <w:tr>
+        <w:trPr>
+          <w:trHeight w:val="392"/>
+          <w:tblCellSpacing w:w="15" w:type="dxa"/>
+        </w:trPr>
+        <w:tc>
+          <w:tcPr>
+            <w:tcW w:w="0" w:type="auto"/>
+            <w:vAlign w:val="center"/>
+            <w:hideMark/>
+          </w:tcPr>
+          <w:p>
+            <w:pPr>
+              <w:spacing w:after="0" w:line="360" w:lineRule="auto"/>
+              <w:rPr>
+                <w:rFonts w:eastAsia="Times New Roman" w:cs="Times New Roman"/>
+                <w:szCs w:val="26"/>
+              </w:rPr>
+            </w:pPr>
+            <w:r>
+              <w:rPr>
+                <w:rFonts w:eastAsia="Times New Roman" w:cs="Times New Roman"/>
+                <w:b/>
+                <w:bCs/>
+                <w:szCs w:val="26"/>
+              </w:rPr>
+              <w:t>State</w:t>
+            </w:r>
+          </w:p>
+        </w:tc>
+        <w:tc>
+          <w:tcPr>
+            <w:tcW w:w="0" w:type="auto"/>
+            <w:vAlign w:val="center"/>
+            <w:hideMark/>
+          </w:tcPr>
+          <w:p>
+            <w:pPr>
+              <w:spacing w:after="0" w:line="360" w:lineRule="auto"/>
+              <w:rPr>
+                <w:rFonts w:eastAsia="Times New Roman" w:cs="Times New Roman"/>
+                <w:szCs w:val="26"/>
+              </w:rPr>
+            </w:pPr>
+            <w:r>
+              <w:rPr>
+                <w:rFonts w:eastAsia="Times New Roman" w:cs="Times New Roman"/>
+                <w:szCs w:val="26"/>
+              </w:rPr>
+              <w:t>Trạng thái đơn hàng</w:t>
+            </w:r>
+          </w:p>
+        </w:tc>
+      </w:tr>
+      <w:tr>
+        <w:trPr>
+          <w:trHeight w:val="392"/>
+          <w:tblCellSpacing w:w="15" w:type="dxa"/>
+        </w:trPr>
+        <w:tc>
+          <w:tcPr>
+            <w:tcW w:w="0" w:type="auto"/>
+            <w:vAlign w:val="center"/>
+            <w:hideMark/>
+          </w:tcPr>
+          <w:p>
+            <w:pPr>
+              <w:spacing w:after="0" w:line="360" w:lineRule="auto"/>
+              <w:rPr>
+                <w:rFonts w:eastAsia="Times New Roman" w:cs="Times New Roman"/>
+                <w:szCs w:val="26"/>
+              </w:rPr>
+            </w:pPr>
+            <w:r>
+              <w:rPr>
+                <w:rFonts w:eastAsia="Times New Roman" w:cs="Times New Roman"/>
+                <w:b/>
+                <w:bCs/>
+                <w:szCs w:val="26"/>
+              </w:rPr>
+              <w:t>Strategy</w:t>
+            </w:r>
+          </w:p>
+        </w:tc>
+        <w:tc>
+          <w:tcPr>
+            <w:tcW w:w="0" w:type="auto"/>
+            <w:vAlign w:val="center"/>
+            <w:hideMark/>
+          </w:tcPr>
+          <w:p>
+            <w:pPr>
+              <w:spacing w:after="0" w:line="360" w:lineRule="auto"/>
+              <w:rPr>
+                <w:rFonts w:eastAsia="Times New Roman" w:cs="Times New Roman"/>
+                <w:szCs w:val="26"/>
+              </w:rPr>
+            </w:pPr>
+            <w:r>
+              <w:rPr>
+                <w:rFonts w:eastAsia="Times New Roman" w:cs="Times New Roman"/>
+                <w:szCs w:val="26"/>
+              </w:rPr>
+              <w:t>Cách vận chuyển</w:t>
+            </w:r>
+          </w:p>
+        </w:tc>
+      </w:tr>
+      <w:tr>
+        <w:trPr>
+          <w:trHeight w:val="375"/>
+          <w:tblCellSpacing w:w="15" w:type="dxa"/>
+        </w:trPr>
+        <w:tc>
+          <w:tcPr>
+            <w:tcW w:w="0" w:type="auto"/>
+            <w:vAlign w:val="center"/>
+            <w:hideMark/>
+          </w:tcPr>
+          <w:p>
+            <w:pPr>
+              <w:spacing w:after="0" w:line="360" w:lineRule="auto"/>
+              <w:rPr>
+                <w:rFonts w:eastAsia="Times New Roman" w:cs="Times New Roman"/>
+                <w:szCs w:val="26"/>
+              </w:rPr>
+            </w:pPr>
+            <w:r>
+              <w:rPr>
+                <w:rFonts w:eastAsia="Times New Roman" w:cs="Times New Roman"/>
+                <w:b/>
+                <w:bCs/>
+                <w:szCs w:val="26"/>
+              </w:rPr>
+              <w:t>Decorator</w:t>
+            </w:r>
+          </w:p>
+        </w:tc>
+        <w:tc>
+          <w:tcPr>
+            <w:tcW w:w="0" w:type="auto"/>
+            <w:vAlign w:val="center"/>
+            <w:hideMark/>
+          </w:tcPr>
+          <w:p>
+            <w:pPr>
+              <w:spacing w:after="0" w:line="360" w:lineRule="auto"/>
+              <w:rPr>
+                <w:rFonts w:eastAsia="Times New Roman" w:cs="Times New Roman"/>
+                <w:szCs w:val="26"/>
+              </w:rPr>
+            </w:pPr>
+            <w:r>
+              <w:rPr>
+                <w:rFonts w:eastAsia="Times New Roman" w:cs="Times New Roman"/>
+                <w:szCs w:val="26"/>
+              </w:rPr>
+              <w:t>Thêm tính năng (bảo hiểm, giao nhanh)</w:t>
+            </w:r>
+          </w:p>
+        </w:tc>
+      </w:tr>
+    </w:tbl>
+    <w:p>
+      <w:pPr>
         <w:pStyle w:val="NormalWeb"/>
         <w:spacing w:before="0" w:beforeAutospacing="0" w:after="0" w:afterAutospacing="0" w:line="360" w:lineRule="auto"/>
         <w:rPr>
@@ -687,14 +1233,97 @@
           <w:sz w:val="26"/>
           <w:szCs w:val="26"/>
         </w:rPr>
-        <w:t xml:space="preserve">PHẦN 3: </w:t>
+        <w:drawing>
+          <wp:inline distT="0" distB="0" distL="0" distR="0" wp14:anchorId="6FA0CD9F" wp14:editId="54744EE7">
+            <wp:extent cx="5943600" cy="3962400"/>
+            <wp:effectExtent l="0" t="0" r="0" b="0"/>
+            <wp:docPr id="3" name="Picture 3"/>
+            <wp:cNvGraphicFramePr>
+              <a:graphicFrameLocks xmlns:a="http://schemas.openxmlformats.org/drawingml/2006/main" noChangeAspect="1"/>
+            </wp:cNvGraphicFramePr>
+            <a:graphic xmlns:a="http://schemas.openxmlformats.org/drawingml/2006/main">
+              <a:graphicData uri="http://schemas.openxmlformats.org/drawingml/2006/picture">
+                <pic:pic xmlns:pic="http://schemas.openxmlformats.org/drawingml/2006/picture">
+                  <pic:nvPicPr>
+                    <pic:cNvPr id="1" name=""/>
+                    <pic:cNvPicPr/>
+                  </pic:nvPicPr>
+                  <pic:blipFill>
+                    <a:blip r:embed="rId7"/>
+                    <a:stretch>
+                      <a:fillRect/>
+                    </a:stretch>
+                  </pic:blipFill>
+                  <pic:spPr>
+                    <a:xfrm>
+                      <a:off x="0" y="0"/>
+                      <a:ext cx="5943600" cy="3962400"/>
+                    </a:xfrm>
+                    <a:prstGeom prst="rect">
+                      <a:avLst/>
+                    </a:prstGeom>
+                  </pic:spPr>
+                </pic:pic>
+              </a:graphicData>
+            </a:graphic>
+          </wp:inline>
+        </w:drawing>
+      </w:r>
+    </w:p>
+    <w:p>
+      <w:pPr>
+        <w:pStyle w:val="ListParagraph"/>
+        <w:numPr>
+          <w:ilvl w:val="0"/>
+          <w:numId w:val="37"/>
+        </w:numPr>
+        <w:spacing w:after="0" w:line="360" w:lineRule="auto"/>
+        <w:rPr>
+          <w:rFonts w:cs="Times New Roman"/>
+          <w:szCs w:val="26"/>
+        </w:rPr>
+      </w:pPr>
+      <w:r>
+        <w:rPr>
+          <w:rFonts w:cs="Times New Roman"/>
+          <w:szCs w:val="26"/>
+        </w:rPr>
+        <w:t>Việc áp dụng State Pattern giúp quản lý trạng thái đơn hàng rõ ràng và linh hoạt.</w:t>
       </w:r>
       <w:r>
         <w:rPr>
-          <w:szCs w:val="26"/>
-        </w:rPr>
-        <w:t>Architecture</w:t>
+          <w:rFonts w:cs="Times New Roman"/>
+          <w:szCs w:val="26"/>
+        </w:rPr>
+        <w:br/>
+        <w:t>Strategy Pattern cho phép thay đổi phương thức vận chuyển tại thời điểm chạy chương trình.</w:t>
       </w:r>
+      <w:r>
+        <w:rPr>
+          <w:rFonts w:cs="Times New Roman"/>
+          <w:szCs w:val="26"/>
+        </w:rPr>
+        <w:br/>
+        <w:t>Decorator Pattern giúp mở rộng chức năng đơn hàng mà không cần thay đổi mã nguồn gốc.</w:t>
+      </w:r>
+      <w:r>
+        <w:rPr>
+          <w:rFonts w:cs="Times New Roman"/>
+          <w:szCs w:val="26"/>
+        </w:rPr>
+        <w:br/>
+        <w:t>Sự kết hợp các pattern giúp hệ thống dễ mở rộng, dễ bảo trì và tuân thủ nguyên tắc thiết kế hướng đối tượng.</w:t>
+      </w:r>
+    </w:p>
+    <w:p>
+      <w:pPr>
+        <w:pStyle w:val="NormalWeb"/>
+        <w:spacing w:before="0" w:beforeAutospacing="0" w:after="0" w:afterAutospacing="0" w:line="360" w:lineRule="auto"/>
+        <w:rPr>
+          <w:sz w:val="26"/>
+          <w:szCs w:val="26"/>
+        </w:rPr>
+      </w:pPr>
     </w:p>
     <w:sectPr>
       <w:pgSz w:w="12240" w:h="15840"/>
@@ -709,6 +1338,94 @@
 <file path=word/numbering.xml><?xml version="1.0" encoding="utf-8"?>
 <w:numbering xmlns:wpc="http://schemas.microsoft.com/office/word/2010/wordprocessingCanvas" xmlns:cx="http://schemas.microsoft.com/office/drawing/2014/chartex" xmlns:cx1="http://schemas.microsoft.com/office/drawing/2015/9/8/chartex" xmlns:cx2="http://schemas.microsoft.com/office/drawing/2015/10/21/chartex" xmlns:cx3="http://schemas.microsoft.com/office/drawing/2016/5/9/chartex" xmlns:cx4="http://schemas.microsoft.com/office/drawing/2016/5/10/chartex" xmlns:cx5="http://schemas.microsoft.com/office/drawing/2016/5/11/chartex" xmlns:cx6="http://schemas.microsoft.com/office/drawing/2016/5/12/chartex" xmlns:cx7="http://schemas.microsoft.com/office/drawing/2016/5/13/chartex" xmlns:cx8="http://schemas.microsoft.com/office/drawing/2016/5/14/chartex" xmlns:mc="http://schemas.openxmlformats.org/markup-compatibility/2006" xmlns:aink="http://schemas.microsoft.com/office/drawing/2016/ink" xmlns:am3d="http://schemas.microsoft.com/office/drawing/2017/model3d" xmlns:o="urn:schemas-microsoft-com:office:office" xmlns:r="http://schemas.openxmlformats.org/officeDocument/2006/relationships" xmlns:m="http://schemas.openxmlformats.org/officeDocument/2006/math" xmlns:v="urn:schemas-microsoft-com:vml" xmlns:wp14="http://schemas.microsoft.com/office/word/2010/wordprocessingDrawing" xmlns:wp="http://schemas.openxmlformats.org/drawingml/2006/wordprocessingDrawing" xmlns:w10="urn:schemas-microsoft-com:office:word" xmlns:w="http://schemas.openxmlformats.org/wordprocessingml/2006/main" xmlns:w14="http://schemas.microsoft.com/office/word/2010/wordml" xmlns:w15="http://schemas.microsoft.com/office/word/2012/wordml" xmlns:w16cex="http://schemas.microsoft.com/office/word/2018/wordml/cex" xmlns:w16cid="http://schemas.microsoft.com/office/word/2016/wordml/cid" xmlns:w16="http://schemas.microsoft.com/office/word/2018/wordml" xmlns:w16sdtdh="http://schemas.microsoft.com/office/word/2020/wordml/sdtdatahash" xmlns:w16se="http://schemas.microsoft.com/office/word/2015/wordml/symex" xmlns:wpg="http://schemas.microsoft.com/office/word/2010/wordprocessingGroup" xmlns:wpi="http://schemas.microsoft.com/office/word/2010/wordprocessingInk" xmlns:wne="http://schemas.microsoft.com/office/word/2006/wordml" xmlns:wps="http://schemas.microsoft.com/office/word/2010/wordprocessingShape" mc:Ignorable="w14 w15 w16se w16cid w16 w16cex w16sdtdh wp14">
   <w:abstractNum w:abstractNumId="0" w15:restartNumberingAfterBreak="0">
+    <w:nsid w:val="00EB6FFE"/>
+    <w:multiLevelType w:val="hybridMultilevel"/>
+    <w:tmpl w:val="583ED04A"/>
+    <w:lvl w:ilvl="0" w:tplc="51F48198">
+      <w:numFmt w:val="bullet"/>
+      <w:lvlText w:val="-"/>
+      <w:lvlJc w:val="left"/>
+      <w:pPr>
+        <w:ind w:left="360" w:hanging="360"/>
+      </w:pPr>
+      <w:rPr>
+        <w:rFonts w:ascii="Times New Roman" w:eastAsiaTheme="minorHAnsi" w:hAnsi="Times New Roman" w:cs="Times New Roman" w:hint="default"/>
+      </w:rPr>
+    </w:lvl>
+    <w:lvl w:ilvl="1" w:tplc="04090019" w:tentative="1">
+      <w:start w:val="1"/>
+      <w:numFmt w:val="lowerLetter"/>
+      <w:lvlText w:val="%2."/>
+      <w:lvlJc w:val="left"/>
+      <w:pPr>
+        <w:ind w:left="1080" w:hanging="360"/>
+      </w:pPr>
+    </w:lvl>
+    <w:lvl w:ilvl="2" w:tplc="0409001B" w:tentative="1">
+      <w:start w:val="1"/>
+      <w:numFmt w:val="lowerRoman"/>
+      <w:lvlText w:val="%3."/>
+      <w:lvlJc w:val="right"/>
+      <w:pPr>
+        <w:ind w:left="1800" w:hanging="180"/>
+      </w:pPr>
+    </w:lvl>
+    <w:lvl w:ilvl="3" w:tplc="0409000F" w:tentative="1">
+      <w:start w:val="1"/>
+      <w:numFmt w:val="decimal"/>
+      <w:lvlText w:val="%4."/>
+      <w:lvlJc w:val="left"/>
+      <w:pPr>
+        <w:ind w:left="2520" w:hanging="360"/>
+      </w:pPr>
+    </w:lvl>
+    <w:lvl w:ilvl="4" w:tplc="04090019" w:tentative="1">
+      <w:start w:val="1"/>
+      <w:numFmt w:val="lowerLetter"/>
+      <w:lvlText w:val="%5."/>
+      <w:lvlJc w:val="left"/>
+      <w:pPr>
+        <w:ind w:left="3240" w:hanging="360"/>
+      </w:pPr>
+    </w:lvl>
+    <w:lvl w:ilvl="5" w:tplc="0409001B" w:tentative="1">
+      <w:start w:val="1"/>
+      <w:numFmt w:val="lowerRoman"/>
+      <w:lvlText w:val="%6."/>
+      <w:lvlJc w:val="right"/>
+      <w:pPr>
+        <w:ind w:left="3960" w:hanging="180"/>
+      </w:pPr>
+    </w:lvl>
+    <w:lvl w:ilvl="6" w:tplc="0409000F" w:tentative="1">
+      <w:start w:val="1"/>
+      <w:numFmt w:val="decimal"/>
+      <w:lvlText w:val="%7."/>
+      <w:lvlJc w:val="left"/>
+      <w:pPr>
+        <w:ind w:left="4680" w:hanging="360"/>
+      </w:pPr>
+    </w:lvl>
+    <w:lvl w:ilvl="7" w:tplc="04090019" w:tentative="1">
+      <w:start w:val="1"/>
+      <w:numFmt w:val="lowerLetter"/>
+      <w:lvlText w:val="%8."/>
+      <w:lvlJc w:val="left"/>
+      <w:pPr>
+        <w:ind w:left="5400" w:hanging="360"/>
+      </w:pPr>
+    </w:lvl>
+    <w:lvl w:ilvl="8" w:tplc="0409001B" w:tentative="1">
+      <w:start w:val="1"/>
+      <w:numFmt w:val="lowerRoman"/>
+      <w:lvlText w:val="%9."/>
+      <w:lvlJc w:val="right"/>
+      <w:pPr>
+        <w:ind w:left="6120" w:hanging="180"/>
+      </w:pPr>
+    </w:lvl>
+  </w:abstractNum>
+  <w:abstractNum w:abstractNumId="1" w15:restartNumberingAfterBreak="0">
     <w:nsid w:val="05B05258"/>
     <w:multiLevelType w:val="multilevel"/>
     <w:tmpl w:val="7A1056E0"/>
@@ -857,7 +1574,7 @@
       </w:rPr>
     </w:lvl>
   </w:abstractNum>
-  <w:abstractNum w:abstractNumId="1" w15:restartNumberingAfterBreak="0">
+  <w:abstractNum w:abstractNumId="2" w15:restartNumberingAfterBreak="0">
     <w:nsid w:val="06A35C4C"/>
     <w:multiLevelType w:val="hybridMultilevel"/>
     <w:tmpl w:val="EBF2358A"/>
@@ -946,7 +1663,96 @@
       </w:pPr>
     </w:lvl>
   </w:abstractNum>
-  <w:abstractNum w:abstractNumId="2" w15:restartNumberingAfterBreak="0">
+  <w:abstractNum w:abstractNumId="3" w15:restartNumberingAfterBreak="0">
+    <w:nsid w:val="097505CB"/>
+    <w:multiLevelType w:val="hybridMultilevel"/>
+    <w:tmpl w:val="C7FE16C8"/>
+    <w:lvl w:ilvl="0" w:tplc="04090001">
+      <w:start w:val="1"/>
+      <w:numFmt w:val="bullet"/>
+      <w:lvlText w:val=""/>
+      <w:lvlJc w:val="left"/>
+      <w:pPr>
+        <w:ind w:left="1080" w:hanging="360"/>
+      </w:pPr>
+      <w:rPr>
+        <w:rFonts w:ascii="Symbol" w:hAnsi="Symbol" w:hint="default"/>
+      </w:rPr>
+    </w:lvl>
+    <w:lvl w:ilvl="1" w:tplc="04090019" w:tentative="1">
+      <w:start w:val="1"/>
+      <w:numFmt w:val="lowerLetter"/>
+      <w:lvlText w:val="%2."/>
+      <w:lvlJc w:val="left"/>
+      <w:pPr>
+        <w:ind w:left="1800" w:hanging="360"/>
+      </w:pPr>
+    </w:lvl>
+    <w:lvl w:ilvl="2" w:tplc="0409001B" w:tentative="1">
+      <w:start w:val="1"/>
+      <w:numFmt w:val="lowerRoman"/>
+      <w:lvlText w:val="%3."/>
+      <w:lvlJc w:val="right"/>
+      <w:pPr>
+        <w:ind w:left="2520" w:hanging="180"/>
+      </w:pPr>
+    </w:lvl>
+    <w:lvl w:ilvl="3" w:tplc="0409000F" w:tentative="1">
+      <w:start w:val="1"/>
+      <w:numFmt w:val="decimal"/>
+      <w:lvlText w:val="%4."/>
+      <w:lvlJc w:val="left"/>
+      <w:pPr>
+        <w:ind w:left="3240" w:hanging="360"/>
+      </w:pPr>
+    </w:lvl>
+    <w:lvl w:ilvl="4" w:tplc="04090019" w:tentative="1">
+      <w:start w:val="1"/>
+      <w:numFmt w:val="lowerLetter"/>
+      <w:lvlText w:val="%5."/>
+      <w:lvlJc w:val="left"/>
+      <w:pPr>
+        <w:ind w:left="3960" w:hanging="360"/>
+      </w:pPr>
+    </w:lvl>
+    <w:lvl w:ilvl="5" w:tplc="0409001B" w:tentative="1">
+      <w:start w:val="1"/>
+      <w:numFmt w:val="lowerRoman"/>
+      <w:lvlText w:val="%6."/>
+      <w:lvlJc w:val="right"/>
+      <w:pPr>
+        <w:ind w:left="4680" w:hanging="180"/>
+      </w:pPr>
+    </w:lvl>
+    <w:lvl w:ilvl="6" w:tplc="0409000F" w:tentative="1">
+      <w:start w:val="1"/>
+      <w:numFmt w:val="decimal"/>
+      <w:lvlText w:val="%7."/>
+      <w:lvlJc w:val="left"/>
+      <w:pPr>
+        <w:ind w:left="5400" w:hanging="360"/>
+      </w:pPr>
+    </w:lvl>
+    <w:lvl w:ilvl="7" w:tplc="04090019" w:tentative="1">
+      <w:start w:val="1"/>
+      <w:numFmt w:val="lowerLetter"/>
+      <w:lvlText w:val="%8."/>
+      <w:lvlJc w:val="left"/>
+      <w:pPr>
+        <w:ind w:left="6120" w:hanging="360"/>
+      </w:pPr>
+    </w:lvl>
+    <w:lvl w:ilvl="8" w:tplc="0409001B" w:tentative="1">
+      <w:start w:val="1"/>
+      <w:numFmt w:val="lowerRoman"/>
+      <w:lvlText w:val="%9."/>
+      <w:lvlJc w:val="right"/>
+      <w:pPr>
+        <w:ind w:left="6840" w:hanging="180"/>
+      </w:pPr>
+    </w:lvl>
+  </w:abstractNum>
+  <w:abstractNum w:abstractNumId="4" w15:restartNumberingAfterBreak="0">
     <w:nsid w:val="0A076DBE"/>
     <w:multiLevelType w:val="hybridMultilevel"/>
     <w:tmpl w:val="5322DA48"/>
@@ -1035,7 +1841,7 @@
       </w:pPr>
     </w:lvl>
   </w:abstractNum>
-  <w:abstractNum w:abstractNumId="3" w15:restartNumberingAfterBreak="0">
+  <w:abstractNum w:abstractNumId="5" w15:restartNumberingAfterBreak="0">
     <w:nsid w:val="0B2B12B4"/>
     <w:multiLevelType w:val="multilevel"/>
     <w:tmpl w:val="48F665A0"/>
@@ -1184,7 +1990,7 @@
       </w:rPr>
     </w:lvl>
   </w:abstractNum>
-  <w:abstractNum w:abstractNumId="4" w15:restartNumberingAfterBreak="0">
+  <w:abstractNum w:abstractNumId="6" w15:restartNumberingAfterBreak="0">
     <w:nsid w:val="10274C95"/>
     <w:multiLevelType w:val="multilevel"/>
     <w:tmpl w:val="6DDC0510"/>
@@ -1333,7 +2139,7 @@
       </w:rPr>
     </w:lvl>
   </w:abstractNum>
-  <w:abstractNum w:abstractNumId="5" w15:restartNumberingAfterBreak="0">
+  <w:abstractNum w:abstractNumId="7" w15:restartNumberingAfterBreak="0">
     <w:nsid w:val="132A5A42"/>
     <w:multiLevelType w:val="multilevel"/>
     <w:tmpl w:val="ACFA62AE"/>
@@ -1482,7 +2288,7 @@
       </w:rPr>
     </w:lvl>
   </w:abstractNum>
-  <w:abstractNum w:abstractNumId="6" w15:restartNumberingAfterBreak="0">
+  <w:abstractNum w:abstractNumId="8" w15:restartNumberingAfterBreak="0">
     <w:nsid w:val="1D840341"/>
     <w:multiLevelType w:val="multilevel"/>
     <w:tmpl w:val="297608F4"/>
@@ -1631,7 +2437,7 @@
       </w:rPr>
     </w:lvl>
   </w:abstractNum>
-  <w:abstractNum w:abstractNumId="7" w15:restartNumberingAfterBreak="0">
+  <w:abstractNum w:abstractNumId="9" w15:restartNumberingAfterBreak="0">
     <w:nsid w:val="1FB05E89"/>
     <w:multiLevelType w:val="multilevel"/>
     <w:tmpl w:val="D0AE3F18"/>
@@ -1780,7 +2586,7 @@
       </w:rPr>
     </w:lvl>
   </w:abstractNum>
-  <w:abstractNum w:abstractNumId="8" w15:restartNumberingAfterBreak="0">
+  <w:abstractNum w:abstractNumId="10" w15:restartNumberingAfterBreak="0">
     <w:nsid w:val="21B96F37"/>
     <w:multiLevelType w:val="multilevel"/>
     <w:tmpl w:val="E124D48A"/>
@@ -1929,7 +2735,7 @@
       </w:rPr>
     </w:lvl>
   </w:abstractNum>
-  <w:abstractNum w:abstractNumId="9" w15:restartNumberingAfterBreak="0">
+  <w:abstractNum w:abstractNumId="11" w15:restartNumberingAfterBreak="0">
     <w:nsid w:val="232745C0"/>
     <w:multiLevelType w:val="multilevel"/>
     <w:tmpl w:val="41DCEBD0"/>
@@ -2078,7 +2884,7 @@
       </w:rPr>
     </w:lvl>
   </w:abstractNum>
-  <w:abstractNum w:abstractNumId="10" w15:restartNumberingAfterBreak="0">
+  <w:abstractNum w:abstractNumId="12" w15:restartNumberingAfterBreak="0">
     <w:nsid w:val="27B46DF9"/>
     <w:multiLevelType w:val="hybridMultilevel"/>
     <w:tmpl w:val="4E0CAF0C"/>
@@ -2167,7 +2973,7 @@
       </w:pPr>
     </w:lvl>
   </w:abstractNum>
-  <w:abstractNum w:abstractNumId="11" w15:restartNumberingAfterBreak="0">
+  <w:abstractNum w:abstractNumId="13" w15:restartNumberingAfterBreak="0">
     <w:nsid w:val="285E5FBE"/>
     <w:multiLevelType w:val="hybridMultilevel"/>
     <w:tmpl w:val="3A263068"/>
@@ -2256,7 +3062,7 @@
       </w:pPr>
     </w:lvl>
   </w:abstractNum>
-  <w:abstractNum w:abstractNumId="12" w15:restartNumberingAfterBreak="0">
+  <w:abstractNum w:abstractNumId="14" w15:restartNumberingAfterBreak="0">
     <w:nsid w:val="2A3608E0"/>
     <w:multiLevelType w:val="hybridMultilevel"/>
     <w:tmpl w:val="9100254C"/>
@@ -2345,7 +3151,7 @@
       </w:pPr>
     </w:lvl>
   </w:abstractNum>
-  <w:abstractNum w:abstractNumId="13" w15:restartNumberingAfterBreak="0">
+  <w:abstractNum w:abstractNumId="15" w15:restartNumberingAfterBreak="0">
     <w:nsid w:val="2B5A4EA1"/>
     <w:multiLevelType w:val="multilevel"/>
     <w:tmpl w:val="94421DDC"/>
@@ -2494,7 +3300,7 @@
       </w:rPr>
     </w:lvl>
   </w:abstractNum>
-  <w:abstractNum w:abstractNumId="14" w15:restartNumberingAfterBreak="0">
+  <w:abstractNum w:abstractNumId="16" w15:restartNumberingAfterBreak="0">
     <w:nsid w:val="32DB43AE"/>
     <w:multiLevelType w:val="multilevel"/>
     <w:tmpl w:val="7B0CE50E"/>
@@ -2643,7 +3449,7 @@
       </w:rPr>
     </w:lvl>
   </w:abstractNum>
-  <w:abstractNum w:abstractNumId="15" w15:restartNumberingAfterBreak="0">
+  <w:abstractNum w:abstractNumId="17" w15:restartNumberingAfterBreak="0">
     <w:nsid w:val="32F06A28"/>
     <w:multiLevelType w:val="multilevel"/>
     <w:tmpl w:val="B31CBBF6"/>
@@ -2792,7 +3598,7 @@
       </w:rPr>
     </w:lvl>
   </w:abstractNum>
-  <w:abstractNum w:abstractNumId="16" w15:restartNumberingAfterBreak="0">
+  <w:abstractNum w:abstractNumId="18" w15:restartNumberingAfterBreak="0">
     <w:nsid w:val="3AA16B9F"/>
     <w:multiLevelType w:val="hybridMultilevel"/>
     <w:tmpl w:val="3EB2C210"/>
@@ -2881,7 +3687,7 @@
       </w:pPr>
     </w:lvl>
   </w:abstractNum>
-  <w:abstractNum w:abstractNumId="17" w15:restartNumberingAfterBreak="0">
+  <w:abstractNum w:abstractNumId="19" w15:restartNumberingAfterBreak="0">
     <w:nsid w:val="44B934DA"/>
     <w:multiLevelType w:val="hybridMultilevel"/>
     <w:tmpl w:val="2DC66CD6"/>
@@ -2970,7 +3776,7 @@
       </w:pPr>
     </w:lvl>
   </w:abstractNum>
-  <w:abstractNum w:abstractNumId="18" w15:restartNumberingAfterBreak="0">
+  <w:abstractNum w:abstractNumId="20" w15:restartNumberingAfterBreak="0">
     <w:nsid w:val="4C4F25C2"/>
     <w:multiLevelType w:val="multilevel"/>
     <w:tmpl w:val="68642B30"/>
@@ -3119,7 +3925,7 @@
       </w:rPr>
     </w:lvl>
   </w:abstractNum>
-  <w:abstractNum w:abstractNumId="19" w15:restartNumberingAfterBreak="0">
+  <w:abstractNum w:abstractNumId="21" w15:restartNumberingAfterBreak="0">
     <w:nsid w:val="4ECE6E60"/>
     <w:multiLevelType w:val="hybridMultilevel"/>
     <w:tmpl w:val="B874CF92"/>
@@ -3208,7 +4014,7 @@
       </w:pPr>
     </w:lvl>
   </w:abstractNum>
-  <w:abstractNum w:abstractNumId="20" w15:restartNumberingAfterBreak="0">
+  <w:abstractNum w:abstractNumId="22" w15:restartNumberingAfterBreak="0">
     <w:nsid w:val="52B4170A"/>
     <w:multiLevelType w:val="hybridMultilevel"/>
     <w:tmpl w:val="063EB806"/>
@@ -3297,7 +4103,7 @@
       </w:pPr>
     </w:lvl>
   </w:abstractNum>
-  <w:abstractNum w:abstractNumId="21" w15:restartNumberingAfterBreak="0">
+  <w:abstractNum w:abstractNumId="23" w15:restartNumberingAfterBreak="0">
     <w:nsid w:val="54DF252C"/>
     <w:multiLevelType w:val="hybridMultilevel"/>
     <w:tmpl w:val="B8D42350"/>
@@ -3386,7 +4192,7 @@
       </w:pPr>
     </w:lvl>
   </w:abstractNum>
-  <w:abstractNum w:abstractNumId="22" w15:restartNumberingAfterBreak="0">
+  <w:abstractNum w:abstractNumId="24" w15:restartNumberingAfterBreak="0">
     <w:nsid w:val="5FA225B7"/>
     <w:multiLevelType w:val="hybridMultilevel"/>
     <w:tmpl w:val="6DF862E8"/>
@@ -3475,7 +4281,7 @@
       </w:pPr>
     </w:lvl>
   </w:abstractNum>
-  <w:abstractNum w:abstractNumId="23" w15:restartNumberingAfterBreak="0">
+  <w:abstractNum w:abstractNumId="25" w15:restartNumberingAfterBreak="0">
     <w:nsid w:val="61582CDF"/>
     <w:multiLevelType w:val="multilevel"/>
     <w:tmpl w:val="5D8A0844"/>
@@ -3624,7 +4430,7 @@
       </w:rPr>
     </w:lvl>
   </w:abstractNum>
-  <w:abstractNum w:abstractNumId="24" w15:restartNumberingAfterBreak="0">
+  <w:abstractNum w:abstractNumId="26" w15:restartNumberingAfterBreak="0">
     <w:nsid w:val="64FE3794"/>
     <w:multiLevelType w:val="hybridMultilevel"/>
     <w:tmpl w:val="C0260A54"/>
@@ -3737,10 +4543,10 @@
       </w:rPr>
     </w:lvl>
   </w:abstractNum>
-  <w:abstractNum w:abstractNumId="25" w15:restartNumberingAfterBreak="0">
+  <w:abstractNum w:abstractNumId="27" w15:restartNumberingAfterBreak="0">
     <w:nsid w:val="6AB85E20"/>
     <w:multiLevelType w:val="hybridMultilevel"/>
-    <w:tmpl w:val="7004E01C"/>
+    <w:tmpl w:val="8D0A4A14"/>
     <w:lvl w:ilvl="0" w:tplc="0409000F">
       <w:start w:val="1"/>
       <w:numFmt w:val="decimal"/>
@@ -3823,7 +4629,7 @@
       </w:pPr>
     </w:lvl>
   </w:abstractNum>
-  <w:abstractNum w:abstractNumId="26" w15:restartNumberingAfterBreak="0">
+  <w:abstractNum w:abstractNumId="28" w15:restartNumberingAfterBreak="0">
     <w:nsid w:val="6C5132C6"/>
     <w:multiLevelType w:val="multilevel"/>
     <w:tmpl w:val="3EC8E33C"/>
@@ -3972,7 +4778,7 @@
       </w:rPr>
     </w:lvl>
   </w:abstractNum>
-  <w:abstractNum w:abstractNumId="27" w15:restartNumberingAfterBreak="0">
+  <w:abstractNum w:abstractNumId="29" w15:restartNumberingAfterBreak="0">
     <w:nsid w:val="6CBD5CAD"/>
     <w:multiLevelType w:val="multilevel"/>
     <w:tmpl w:val="415E4270"/>
@@ -4121,7 +4927,7 @@
       </w:rPr>
     </w:lvl>
   </w:abstractNum>
-  <w:abstractNum w:abstractNumId="28" w15:restartNumberingAfterBreak="0">
+  <w:abstractNum w:abstractNumId="30" w15:restartNumberingAfterBreak="0">
     <w:nsid w:val="6DCD1148"/>
     <w:multiLevelType w:val="multilevel"/>
     <w:tmpl w:val="77E4CB70"/>
@@ -4270,7 +5076,156 @@
       </w:rPr>
     </w:lvl>
   </w:abstractNum>
-  <w:abstractNum w:abstractNumId="29" w15:restartNumberingAfterBreak="0">
+  <w:abstractNum w:abstractNumId="31" w15:restartNumberingAfterBreak="0">
+    <w:nsid w:val="6FD50E6A"/>
+    <w:multiLevelType w:val="multilevel"/>
+    <w:tmpl w:val="357ADD4E"/>
+    <w:lvl w:ilvl="0">
+      <w:start w:val="1"/>
+      <w:numFmt w:val="bullet"/>
+      <w:lvlText w:val=""/>
+      <w:lvlJc w:val="left"/>
+      <w:pPr>
+        <w:tabs>
+          <w:tab w:val="num" w:pos="720"/>
+        </w:tabs>
+        <w:ind w:left="720" w:hanging="360"/>
+      </w:pPr>
+      <w:rPr>
+        <w:rFonts w:ascii="Symbol" w:hAnsi="Symbol" w:hint="default"/>
+        <w:sz w:val="20"/>
+      </w:rPr>
+    </w:lvl>
+    <w:lvl w:ilvl="1" w:tentative="1">
+      <w:start w:val="1"/>
+      <w:numFmt w:val="bullet"/>
+      <w:lvlText w:val="o"/>
+      <w:lvlJc w:val="left"/>
+      <w:pPr>
+        <w:tabs>
+          <w:tab w:val="num" w:pos="1440"/>
+        </w:tabs>
+        <w:ind w:left="1440" w:hanging="360"/>
+      </w:pPr>
+      <w:rPr>
+        <w:rFonts w:ascii="Courier New" w:hAnsi="Courier New" w:hint="default"/>
+        <w:sz w:val="20"/>
+      </w:rPr>
+    </w:lvl>
+    <w:lvl w:ilvl="2" w:tentative="1">
+      <w:start w:val="1"/>
+      <w:numFmt w:val="bullet"/>
+      <w:lvlText w:val=""/>
+      <w:lvlJc w:val="left"/>
+      <w:pPr>
+        <w:tabs>
+          <w:tab w:val="num" w:pos="2160"/>
+        </w:tabs>
+        <w:ind w:left="2160" w:hanging="360"/>
+      </w:pPr>
+      <w:rPr>
+        <w:rFonts w:ascii="Wingdings" w:hAnsi="Wingdings" w:hint="default"/>
+        <w:sz w:val="20"/>
+      </w:rPr>
+    </w:lvl>
+    <w:lvl w:ilvl="3" w:tentative="1">
+      <w:start w:val="1"/>
+      <w:numFmt w:val="bullet"/>
+      <w:lvlText w:val=""/>
+      <w:lvlJc w:val="left"/>
+      <w:pPr>
+        <w:tabs>
+          <w:tab w:val="num" w:pos="2880"/>
+        </w:tabs>
+        <w:ind w:left="2880" w:hanging="360"/>
+      </w:pPr>
+      <w:rPr>
+        <w:rFonts w:ascii="Wingdings" w:hAnsi="Wingdings" w:hint="default"/>
+        <w:sz w:val="20"/>
+      </w:rPr>
+    </w:lvl>
+    <w:lvl w:ilvl="4" w:tentative="1">
+      <w:start w:val="1"/>
+      <w:numFmt w:val="bullet"/>
+      <w:lvlText w:val=""/>
+      <w:lvlJc w:val="left"/>
+      <w:pPr>
+        <w:tabs>
+          <w:tab w:val="num" w:pos="3600"/>
+        </w:tabs>
+        <w:ind w:left="3600" w:hanging="360"/>
+      </w:pPr>
+      <w:rPr>
+        <w:rFonts w:ascii="Wingdings" w:hAnsi="Wingdings" w:hint="default"/>
+        <w:sz w:val="20"/>
+      </w:rPr>
+    </w:lvl>
+    <w:lvl w:ilvl="5" w:tentative="1">
+      <w:start w:val="1"/>
+      <w:numFmt w:val="bullet"/>
+      <w:lvlText w:val=""/>
+      <w:lvlJc w:val="left"/>
+      <w:pPr>
+        <w:tabs>
+          <w:tab w:val="num" w:pos="4320"/>
+        </w:tabs>
+        <w:ind w:left="4320" w:hanging="360"/>
+      </w:pPr>
+      <w:rPr>
+        <w:rFonts w:ascii="Wingdings" w:hAnsi="Wingdings" w:hint="default"/>
+        <w:sz w:val="20"/>
+      </w:rPr>
+    </w:lvl>
+    <w:lvl w:ilvl="6" w:tentative="1">
+      <w:start w:val="1"/>
+      <w:numFmt w:val="bullet"/>
+      <w:lvlText w:val=""/>
+      <w:lvlJc w:val="left"/>
+      <w:pPr>
+        <w:tabs>
+          <w:tab w:val="num" w:pos="5040"/>
+        </w:tabs>
+        <w:ind w:left="5040" w:hanging="360"/>
+      </w:pPr>
+      <w:rPr>
+        <w:rFonts w:ascii="Wingdings" w:hAnsi="Wingdings" w:hint="default"/>
+        <w:sz w:val="20"/>
+      </w:rPr>
+    </w:lvl>
+    <w:lvl w:ilvl="7" w:tentative="1">
+      <w:start w:val="1"/>
+      <w:numFmt w:val="bullet"/>
+      <w:lvlText w:val=""/>
+      <w:lvlJc w:val="left"/>
+      <w:pPr>
+        <w:tabs>
+          <w:tab w:val="num" w:pos="5760"/>
+        </w:tabs>
+        <w:ind w:left="5760" w:hanging="360"/>
+      </w:pPr>
+      <w:rPr>
+        <w:rFonts w:ascii="Wingdings" w:hAnsi="Wingdings" w:hint="default"/>
+        <w:sz w:val="20"/>
+      </w:rPr>
+    </w:lvl>
+    <w:lvl w:ilvl="8" w:tentative="1">
+      <w:start w:val="1"/>
+      <w:numFmt w:val="bullet"/>
+      <w:lvlText w:val=""/>
+      <w:lvlJc w:val="left"/>
+      <w:pPr>
+        <w:tabs>
+          <w:tab w:val="num" w:pos="6480"/>
+        </w:tabs>
+        <w:ind w:left="6480" w:hanging="360"/>
+      </w:pPr>
+      <w:rPr>
+        <w:rFonts w:ascii="Wingdings" w:hAnsi="Wingdings" w:hint="default"/>
+        <w:sz w:val="20"/>
+      </w:rPr>
+    </w:lvl>
+  </w:abstractNum>
+  <w:abstractNum w:abstractNumId="32" w15:restartNumberingAfterBreak="0">
     <w:nsid w:val="74966972"/>
     <w:multiLevelType w:val="multilevel"/>
     <w:tmpl w:val="08AC279E"/>
@@ -4419,7 +5374,7 @@
       </w:rPr>
     </w:lvl>
   </w:abstractNum>
-  <w:abstractNum w:abstractNumId="30" w15:restartNumberingAfterBreak="0">
+  <w:abstractNum w:abstractNumId="33" w15:restartNumberingAfterBreak="0">
     <w:nsid w:val="7807664D"/>
     <w:multiLevelType w:val="multilevel"/>
     <w:tmpl w:val="DCFC662A"/>
@@ -4568,7 +5523,7 @@
       </w:rPr>
     </w:lvl>
   </w:abstractNum>
-  <w:abstractNum w:abstractNumId="31" w15:restartNumberingAfterBreak="0">
+  <w:abstractNum w:abstractNumId="34" w15:restartNumberingAfterBreak="0">
     <w:nsid w:val="7A892C1A"/>
     <w:multiLevelType w:val="multilevel"/>
     <w:tmpl w:val="50E6D87E"/>
@@ -4717,7 +5672,7 @@
       </w:rPr>
     </w:lvl>
   </w:abstractNum>
-  <w:abstractNum w:abstractNumId="32" w15:restartNumberingAfterBreak="0">
+  <w:abstractNum w:abstractNumId="35" w15:restartNumberingAfterBreak="0">
     <w:nsid w:val="7C744424"/>
     <w:multiLevelType w:val="multilevel"/>
     <w:tmpl w:val="99F2488E"/>
@@ -4831,91 +5786,91 @@
     </w:lvl>
   </w:abstractNum>
   <w:num w:numId="1">
+    <w:abstractNumId w:val="22"/>
+  </w:num>
+  <w:num w:numId="2">
+    <w:abstractNumId w:val="4"/>
+  </w:num>
+  <w:num w:numId="3">
+    <w:abstractNumId w:val="23"/>
+  </w:num>
+  <w:num w:numId="4">
+    <w:abstractNumId w:val="28"/>
+  </w:num>
+  <w:num w:numId="5">
+    <w:abstractNumId w:val="35"/>
+  </w:num>
+  <w:num w:numId="6">
+    <w:abstractNumId w:val="11"/>
+  </w:num>
+  <w:num w:numId="7">
+    <w:abstractNumId w:val="5"/>
+  </w:num>
+  <w:num w:numId="8">
+    <w:abstractNumId w:val="7"/>
+  </w:num>
+  <w:num w:numId="9">
+    <w:abstractNumId w:val="8"/>
+  </w:num>
+  <w:num w:numId="10">
+    <w:abstractNumId w:val="33"/>
+  </w:num>
+  <w:num w:numId="11">
+    <w:abstractNumId w:val="25"/>
+  </w:num>
+  <w:num w:numId="12">
+    <w:abstractNumId w:val="16"/>
+  </w:num>
+  <w:num w:numId="13">
+    <w:abstractNumId w:val="30"/>
+  </w:num>
+  <w:num w:numId="14">
+    <w:abstractNumId w:val="6"/>
+  </w:num>
+  <w:num w:numId="15">
     <w:abstractNumId w:val="20"/>
   </w:num>
-  <w:num w:numId="2">
-    <w:abstractNumId w:val="2"/>
+  <w:num w:numId="16">
+    <w:abstractNumId w:val="15"/>
   </w:num>
-  <w:num w:numId="3">
+  <w:num w:numId="17">
+    <w:abstractNumId w:val="34"/>
+  </w:num>
+  <w:num w:numId="18">
+    <w:abstractNumId w:val="1"/>
+  </w:num>
+  <w:num w:numId="19">
+    <w:abstractNumId w:val="17"/>
+  </w:num>
+  <w:num w:numId="20">
+    <w:abstractNumId w:val="10"/>
+  </w:num>
+  <w:num w:numId="21">
+    <w:abstractNumId w:val="32"/>
+  </w:num>
+  <w:num w:numId="22">
+    <w:abstractNumId w:val="9"/>
+  </w:num>
+  <w:num w:numId="23">
+    <w:abstractNumId w:val="29"/>
+  </w:num>
+  <w:num w:numId="24">
+    <w:abstractNumId w:val="26"/>
+  </w:num>
+  <w:num w:numId="25">
+    <w:abstractNumId w:val="13"/>
+  </w:num>
+  <w:num w:numId="26">
+    <w:abstractNumId w:val="19"/>
+  </w:num>
+  <w:num w:numId="27">
+    <w:abstractNumId w:val="18"/>
+  </w:num>
+  <w:num w:numId="28">
     <w:abstractNumId w:val="21"/>
   </w:num>
-  <w:num w:numId="4">
-    <w:abstractNumId w:val="26"/>
-  </w:num>
-  <w:num w:numId="5">
-    <w:abstractNumId w:val="32"/>
-  </w:num>
-  <w:num w:numId="6">
-    <w:abstractNumId w:val="9"/>
-  </w:num>
-  <w:num w:numId="7">
-    <w:abstractNumId w:val="3"/>
-  </w:num>
-  <w:num w:numId="8">
-    <w:abstractNumId w:val="5"/>
-  </w:num>
-  <w:num w:numId="9">
-    <w:abstractNumId w:val="6"/>
-  </w:num>
-  <w:num w:numId="10">
-    <w:abstractNumId w:val="30"/>
-  </w:num>
-  <w:num w:numId="11">
-    <w:abstractNumId w:val="23"/>
-  </w:num>
-  <w:num w:numId="12">
-    <w:abstractNumId w:val="14"/>
-  </w:num>
-  <w:num w:numId="13">
-    <w:abstractNumId w:val="28"/>
-  </w:num>
-  <w:num w:numId="14">
-    <w:abstractNumId w:val="4"/>
-  </w:num>
-  <w:num w:numId="15">
-    <w:abstractNumId w:val="18"/>
-  </w:num>
-  <w:num w:numId="16">
+  <w:num w:numId="29">
     <w:abstractNumId w:val="13"/>
-  </w:num>
-  <w:num w:numId="17">
-    <w:abstractNumId w:val="31"/>
-  </w:num>
-  <w:num w:numId="18">
-    <w:abstractNumId w:val="0"/>
-  </w:num>
-  <w:num w:numId="19">
-    <w:abstractNumId w:val="15"/>
-  </w:num>
-  <w:num w:numId="20">
-    <w:abstractNumId w:val="8"/>
-  </w:num>
-  <w:num w:numId="21">
-    <w:abstractNumId w:val="29"/>
-  </w:num>
-  <w:num w:numId="22">
-    <w:abstractNumId w:val="7"/>
-  </w:num>
-  <w:num w:numId="23">
-    <w:abstractNumId w:val="27"/>
-  </w:num>
-  <w:num w:numId="24">
-    <w:abstractNumId w:val="24"/>
-  </w:num>
-  <w:num w:numId="25">
-    <w:abstractNumId w:val="11"/>
-  </w:num>
-  <w:num w:numId="26">
-    <w:abstractNumId w:val="17"/>
-  </w:num>
-  <w:num w:numId="27">
-    <w:abstractNumId w:val="16"/>
-  </w:num>
-  <w:num w:numId="28">
-    <w:abstractNumId w:val="19"/>
-  </w:num>
-  <w:num w:numId="29">
-    <w:abstractNumId w:val="11"/>
     <w:lvlOverride w:ilvl="0">
       <w:startOverride w:val="1"/>
     </w:lvlOverride>
@@ -4945,19 +5900,28 @@
     </w:lvlOverride>
   </w:num>
   <w:num w:numId="30">
-    <w:abstractNumId w:val="10"/>
+    <w:abstractNumId w:val="12"/>
   </w:num>
   <w:num w:numId="31">
-    <w:abstractNumId w:val="25"/>
+    <w:abstractNumId w:val="27"/>
   </w:num>
   <w:num w:numId="32">
-    <w:abstractNumId w:val="12"/>
+    <w:abstractNumId w:val="14"/>
   </w:num>
   <w:num w:numId="33">
-    <w:abstractNumId w:val="22"/>
+    <w:abstractNumId w:val="24"/>
   </w:num>
   <w:num w:numId="34">
-    <w:abstractNumId w:val="1"/>
+    <w:abstractNumId w:val="2"/>
+  </w:num>
+  <w:num w:numId="35">
+    <w:abstractNumId w:val="31"/>
+  </w:num>
+  <w:num w:numId="36">
+    <w:abstractNumId w:val="3"/>
+  </w:num>
+  <w:num w:numId="37">
+    <w:abstractNumId w:val="0"/>
   </w:num>
 </w:numbering>
 </file>

</xml_diff>